<commit_message>
Fix typo on engineer CV
</commit_message>
<xml_diff>
--- a/apache2/www/public/se/engineer-resume.docx
+++ b/apache2/www/public/se/engineer-resume.docx
@@ -233,19 +233,7 @@
                 <w:rPr>
                   <w:rStyle w:val="Hyperlink"/>
                 </w:rPr>
-                <w:t>engineer@</w:t>
-              </w:r>
-              <w:r>
-                <w:rPr>
-                  <w:rStyle w:val="Hyperlink"/>
-                </w:rPr>
-                <w:t>r</w:t>
-              </w:r>
-              <w:r>
-                <w:rPr>
-                  <w:rStyle w:val="Hyperlink"/>
-                </w:rPr>
-                <w:t>msy.me</w:t>
+                <w:t>engineer@rmsy.me</w:t>
               </w:r>
               <w:r>
                 <w:br/>
@@ -612,64 +600,19 @@
                 <w:sz w:val="24"/>
                 <w:szCs w:val="24"/>
               </w:rPr>
-              <w:t>System Design Practical (88%)</w:t>
+              <w:t>Compiling Techniques (100%)</w:t>
             </w:r>
           </w:p>
           <w:p>
             <w:pPr>
               <w:pStyle w:val="NoSpacing"/>
               <w:spacing w:after="120"/>
+              <w:rPr>
+                <w:rStyle w:val="Heading3Char"/>
+              </w:rPr>
             </w:pPr>
             <w:r>
-              <w:t>L</w:t>
-            </w:r>
-            <w:r>
-              <w:t xml:space="preserve">ed a group of </w:t>
-            </w:r>
-            <w:r>
-              <w:t>four</w:t>
-            </w:r>
-            <w:r>
-              <w:t xml:space="preserve"> to design and</w:t>
-            </w:r>
-            <w:r>
-              <w:t xml:space="preserve"> </w:t>
-            </w:r>
-            <w:r>
-              <w:t xml:space="preserve">build a </w:t>
-            </w:r>
-            <w:r>
-              <w:t>football-playing r</w:t>
-            </w:r>
-            <w:r>
-              <w:t>obot</w:t>
-            </w:r>
-            <w:r>
-              <w:t>, p</w:t>
-            </w:r>
-            <w:r>
-              <w:t>lac</w:t>
-            </w:r>
-            <w:r>
-              <w:t>ing</w:t>
-            </w:r>
-            <w:r>
-              <w:t xml:space="preserve"> second in the end-of-year competition, scoring </w:t>
-            </w:r>
-            <w:r>
-              <w:t>six goals</w:t>
-            </w:r>
-            <w:r>
-              <w:t xml:space="preserve">, and winning </w:t>
-            </w:r>
-            <w:r>
-              <w:t xml:space="preserve">the prize </w:t>
-            </w:r>
-            <w:r>
-              <w:t>for the best technical presentation in the year</w:t>
-            </w:r>
-            <w:r>
-              <w:t>.</w:t>
+              <w:t>Implemented (in Java) sections of a compiler for a subset of C, including: lexing, parsing, semantic analysis and Java bytecode generation.</w:t>
             </w:r>
           </w:p>
           <w:p>
@@ -686,31 +629,96 @@
                 <w:sz w:val="24"/>
                 <w:szCs w:val="24"/>
               </w:rPr>
-              <w:t>Compiling Techniques (100%)</w:t>
+              <w:t xml:space="preserve">System Design </w:t>
+            </w:r>
+            <w:r>
+              <w:rPr>
+                <w:rStyle w:val="Heading3Char"/>
+                <w:sz w:val="24"/>
+                <w:szCs w:val="24"/>
+              </w:rPr>
+              <w:t>Projec</w:t>
+            </w:r>
+            <w:r>
+              <w:rPr>
+                <w:rStyle w:val="Heading3Char"/>
+              </w:rPr>
+              <w:t>t</w:t>
+            </w:r>
+            <w:r>
+              <w:rPr>
+                <w:rStyle w:val="Heading3Char"/>
+                <w:sz w:val="24"/>
+                <w:szCs w:val="24"/>
+              </w:rPr>
+              <w:t xml:space="preserve"> (88%)</w:t>
             </w:r>
           </w:p>
           <w:p>
             <w:pPr>
               <w:pStyle w:val="NoSpacing"/>
-              <w:spacing w:after="60"/>
             </w:pPr>
             <w:r>
-              <w:t xml:space="preserve">Implemented (in Java) sections of a </w:t>
-            </w:r>
-            <w:r>
-              <w:t>compiler for a subset of C</w:t>
-            </w:r>
-            <w:r>
-              <w:t xml:space="preserve">, including: </w:t>
-            </w:r>
-            <w:r>
-              <w:t xml:space="preserve">lexing, parsing, semantic analysis and Java </w:t>
-            </w:r>
-            <w:r>
-              <w:t>b</w:t>
-            </w:r>
-            <w:r>
-              <w:t>ytecode generation.</w:t>
+              <w:t>L</w:t>
+            </w:r>
+            <w:r>
+              <w:t xml:space="preserve">ed a group of </w:t>
+            </w:r>
+            <w:r>
+              <w:t>four</w:t>
+            </w:r>
+            <w:r>
+              <w:t xml:space="preserve"> to design and</w:t>
+            </w:r>
+            <w:r>
+              <w:t xml:space="preserve"> </w:t>
+            </w:r>
+            <w:r>
+              <w:t xml:space="preserve">build a </w:t>
+            </w:r>
+            <w:r>
+              <w:t>football-playing r</w:t>
+            </w:r>
+            <w:r>
+              <w:t>obot</w:t>
+            </w:r>
+            <w:r>
+              <w:t>, p</w:t>
+            </w:r>
+            <w:r>
+              <w:t>lac</w:t>
+            </w:r>
+            <w:r>
+              <w:t>ing</w:t>
+            </w:r>
+            <w:r>
+              <w:t xml:space="preserve"> second in the end-of-year competition, scoring </w:t>
+            </w:r>
+            <w:r>
+              <w:t>six goals</w:t>
+            </w:r>
+            <w:r>
+              <w:t xml:space="preserve">, and winning </w:t>
+            </w:r>
+            <w:r>
+              <w:t xml:space="preserve">the </w:t>
+            </w:r>
+            <w:r>
+              <w:rPr>
+                <w:b/>
+                <w:bCs/>
+              </w:rPr>
+              <w:t xml:space="preserve">prize </w:t>
+            </w:r>
+            <w:r>
+              <w:rPr>
+                <w:b/>
+                <w:bCs/>
+              </w:rPr>
+              <w:t>for the best technical presentation in the year</w:t>
+            </w:r>
+            <w:r>
+              <w:t>.</w:t>
             </w:r>
           </w:p>
         </w:tc>
@@ -1495,6 +1503,7 @@
       <w:r>
         <w:rPr>
           <w:rStyle w:val="Heading2Char"/>
+          <w:noProof/>
         </w:rPr>
         <w:drawing>
           <wp:anchor distT="0" distB="0" distL="114300" distR="114300" simplePos="0" relativeHeight="251676672" behindDoc="0" locked="0" layoutInCell="1" allowOverlap="1" wp14:anchorId="30ABC3CF" wp14:editId="507F6DA9">
@@ -1563,6 +1572,7 @@
       <w:r>
         <w:rPr>
           <w:rStyle w:val="Heading2Char"/>
+          <w:noProof/>
           <w:u w:val="single"/>
         </w:rPr>
         <w:drawing>
@@ -3576,6 +3586,7 @@
   <w:style w:type="character" w:default="1" w:styleId="DefaultParagraphFont">
     <w:name w:val="Default Paragraph Font"/>
     <w:uiPriority w:val="1"/>
+    <w:semiHidden/>
     <w:unhideWhenUsed/>
   </w:style>
   <w:style w:type="table" w:default="1" w:styleId="TableNormal">

</xml_diff>